<commit_message>
Update private Chapter 4 and linked references
</commit_message>
<xml_diff>
--- a/public/chapter-4/Chapter4_SNA_AI_Rework_v2.docx
+++ b/public/chapter-4/Chapter4_SNA_AI_Rework_v2.docx
@@ -19,21 +19,54 @@
     <w:p>
       <w:pPr>
         <w:rPr>
-          <w:lang w:val="fr-FR"/>
-        </w:rPr>
-      </w:pPr>
-      <w:r>
-        <w:rPr>
           <w:b/>
           <w:color w:val="4D5A60"/>
           <w:sz w:val="24"/>
           <w:lang w:val="fr-FR"/>
         </w:rPr>
+      </w:pPr>
+      <w:r>
+        <w:rPr>
+          <w:b/>
+          <w:color w:val="4D5A60"/>
+          <w:sz w:val="24"/>
+          <w:lang w:val="fr-FR"/>
+        </w:rPr>
         <w:t>Niveau 2 du protocole ROP — Régulation neuro-végétative et adaptation</w:t>
       </w:r>
     </w:p>
     <w:p>
       <w:pPr>
+        <w:rPr>
+          <w:b/>
+          <w:color w:val="4D5A60"/>
+          <w:sz w:val="24"/>
+          <w:lang w:val="fr-FR"/>
+        </w:rPr>
+      </w:pPr>
+    </w:p>
+    <w:p>
+      <w:pPr>
+        <w:rPr>
+          <w:lang w:val="fr-FR"/>
+        </w:rPr>
+      </w:pPr>
+      <w:r>
+        <w:rPr>
+          <w:lang w:val="fr-FR"/>
+        </w:rPr>
+        <w:t>Le système nerveux autonome (SNA) participe à l’ajustement permanent du fonctionnement des viscères, des glandes, des vaisseaux et de nombreuses fonctions internes. Dans la séquence clinique ROP, il correspond au Niveau 2 — Régulation neuro-végétative et adaptation.</w:t>
+      </w:r>
+    </w:p>
+    <w:p>
+      <w:pPr>
+        <w:rPr>
+          <w:lang w:val="fr-FR"/>
+        </w:rPr>
+      </w:pPr>
+    </w:p>
+    <w:p>
+      <w:pPr>
         <w:pStyle w:val="Heading1"/>
         <w:rPr>
           <w:lang w:val="fr-FR"/>
@@ -58,19 +91,6 @@
           <w:lang w:val="fr-FR"/>
         </w:rPr>
         <w:t>1.1. Deux systèmes : Parasympathique et Sympathique</w:t>
-      </w:r>
-    </w:p>
-    <w:p>
-      <w:pPr>
-        <w:rPr>
-          <w:lang w:val="fr-FR"/>
-        </w:rPr>
-      </w:pPr>
-      <w:r>
-        <w:rPr>
-          <w:lang w:val="fr-FR"/>
-        </w:rPr>
-        <w:t>Le système nerveux autonome (SNA) participe à l’ajustement permanent du fonctionnement des viscères, des glandes, des vaisseaux et de nombreuses fonctions internes. Dans la séquence clinique ROP, il correspond au Niveau 2 — Régulation neuro-végétative et adaptation.</w:t>
       </w:r>
     </w:p>
     <w:p>
@@ -362,6 +382,7 @@
         <w:rPr>
           <w:lang w:val="fr-FR"/>
         </w:rPr>
+        <w:lastRenderedPageBreak/>
         <w:t>Sur le plan des neurotransmetteurs, l’acétylcholine est utilisée par les neurones préganglionnaires sympathiques et parasympathiques ainsi que par les neurones postganglionnaires parasympathiques. La noradrénaline est le médiateur postganglionnaire principal du sympathique, avec plusieurs exceptions fonctionnelles.</w:t>
       </w:r>
     </w:p>
@@ -393,7 +414,6 @@
         <w:rPr>
           <w:lang w:val="fr-FR"/>
         </w:rPr>
-        <w:lastRenderedPageBreak/>
         <w:t>1.6. Relation SNA–système nerveux somatique (SNS)</w:t>
       </w:r>
     </w:p>
@@ -711,6 +731,7 @@
         <w:rPr>
           <w:lang w:val="fr-FR"/>
         </w:rPr>
+        <w:lastRenderedPageBreak/>
         <w:t xml:space="preserve">3. Parasympathique </w:t>
       </w:r>
       <w:proofErr w:type="spellStart"/>
@@ -752,7 +773,6 @@
         <w:rPr>
           <w:lang w:val="fr-FR"/>
         </w:rPr>
-        <w:lastRenderedPageBreak/>
         <w:t>3.1. Parasympathique crânien — territoire céphalique</w:t>
       </w:r>
     </w:p>
@@ -852,7 +872,7 @@
         <w:rPr>
           <w:lang w:val="fr-FR"/>
         </w:rPr>
-        <w:t>Dans la cartographie ROP, ces voies sont abordées par les repères de la base du crâne et des ganglions parasympathiques céphaliques. Les localisations podales restent des repères cliniques et non une projection anatomique directe.</w:t>
+        <w:t xml:space="preserve">Dans la cartographie ROP, ces voies sont abordées par les repères de la base du crâne et des ganglions parasympathiques céphaliques. </w:t>
       </w:r>
     </w:p>
     <w:p>
@@ -916,7 +936,7 @@
         <w:rPr>
           <w:lang w:val="fr-FR"/>
         </w:rPr>
-        <w:t>Le vague est une cible importante du Niveau 2 en raison de son rôle de modulation cardio-respiratoire et digestive, mais aussi de sa forte composante afférente. Une pression ROP ne doit pas être assimilée à une stimulation directe du nerf vague.</w:t>
+        <w:t xml:space="preserve">Le vague est une cible importante du Niveau 2 en raison de son rôle de modulation cardio-respiratoire et digestive, mais aussi de sa forte composante afférente. </w:t>
       </w:r>
     </w:p>
     <w:p>
@@ -1024,7 +1044,35 @@
         <w:rPr>
           <w:lang w:val="fr-FR"/>
         </w:rPr>
-        <w:t>Le sinus carotidien et le glomus carotidien sont des repères physiologiques importants. Ils ne doivent pas être utilisés comme cibles de manipulation directe. Tout malaise, syncope, douleur thoracique ou dyspnée impose d’interrompre le geste et d’orienter vers une évaluation médicale.</w:t>
+        <w:t xml:space="preserve">Le sinus carotidien et </w:t>
+      </w:r>
+      <w:proofErr w:type="gramStart"/>
+      <w:r>
+        <w:rPr>
+          <w:lang w:val="fr-FR"/>
+        </w:rPr>
+        <w:t>le glomus</w:t>
+      </w:r>
+      <w:proofErr w:type="gramEnd"/>
+      <w:r>
+        <w:rPr>
+          <w:lang w:val="fr-FR"/>
+        </w:rPr>
+        <w:t xml:space="preserve"> carotidien sont des repères physiologiques importants. </w:t>
+      </w:r>
+      <w:proofErr w:type="gramStart"/>
+      <w:r>
+        <w:rPr>
+          <w:lang w:val="fr-FR"/>
+        </w:rPr>
+        <w:t>Tout</w:t>
+      </w:r>
+      <w:proofErr w:type="gramEnd"/>
+      <w:r>
+        <w:rPr>
+          <w:lang w:val="fr-FR"/>
+        </w:rPr>
+        <w:t xml:space="preserve"> malaise, syncope, douleur thoracique ou dyspnée impose d’interrompre le geste et d’orienter vers une évaluation médicale.</w:t>
       </w:r>
     </w:p>
     <w:p>
@@ -1176,6 +1224,7 @@
         <w:rPr>
           <w:lang w:val="fr-FR"/>
         </w:rPr>
+        <w:lastRenderedPageBreak/>
         <w:t>3.2.4. Étage diaphragmatique</w:t>
       </w:r>
     </w:p>
@@ -1202,7 +1251,6 @@
         <w:rPr>
           <w:lang w:val="fr-FR"/>
         </w:rPr>
-        <w:lastRenderedPageBreak/>
         <w:t>Le diaphragme n’appartient pas au SNA, mais il constitue une interface fonctionnelle du Niveau 2 par ses relations avec la respiration, les pressions thoraco-abdominales et les structures qui le traversent.</w:t>
       </w:r>
     </w:p>
@@ -1629,7 +1677,13 @@
         <w:rPr>
           <w:lang w:val="fr-FR"/>
         </w:rPr>
-        <w:t>Dans le Niveau 2, le vague est abordé comme une grande voie de communication bidirectionnelle. Les données de neuromodulation permettent d’identifier des circuits plausibles ; elles ne démontrent pas un effet équivalent d’une pression manuelle ROP.</w:t>
+        <w:t>Dans le Niveau 2, le vague est abordé comme une grande voie de communication bidirectionnelle. Les données de neuromodulation permettent d’identifier des circuits plausibles</w:t>
+      </w:r>
+      <w:r>
+        <w:rPr>
+          <w:lang w:val="fr-FR"/>
+        </w:rPr>
+        <w:t>.</w:t>
       </w:r>
     </w:p>
     <w:p>
@@ -1643,6 +1697,7 @@
         <w:rPr>
           <w:lang w:val="fr-FR"/>
         </w:rPr>
+        <w:lastRenderedPageBreak/>
         <w:t xml:space="preserve">5. Sympathique </w:t>
       </w:r>
       <w:proofErr w:type="spellStart"/>
@@ -1703,7 +1758,6 @@
         <w:rPr>
           <w:lang w:val="fr-FR"/>
         </w:rPr>
-        <w:lastRenderedPageBreak/>
         <w:t>À partir de la chaîne paravertébrale, les fibres peuvent faire relais au même niveau, monter ou descendre avant de faire relais, ou traverser la chaîne pour former des nerfs splanchniques destinés aux plexus prévertébraux.</w:t>
       </w:r>
     </w:p>
@@ -1822,21 +1876,7 @@
         <w:rPr>
           <w:lang w:val="fr-FR"/>
         </w:rPr>
-        <w:t xml:space="preserve">La proximité entre nerfs spinaux, structures costo-vertébrales, rameaux méningés et chaîne sympathique constitue un carrefour régional intéressant. Une irritation vertébrale ne doit cependant pas être présentée comme entraînant automatiquement une perturbation de la dynamique </w:t>
-      </w:r>
-      <w:proofErr w:type="spellStart"/>
-      <w:r>
-        <w:rPr>
-          <w:lang w:val="fr-FR"/>
-        </w:rPr>
-        <w:t>crânio-sacrée</w:t>
-      </w:r>
-      <w:proofErr w:type="spellEnd"/>
-      <w:r>
-        <w:rPr>
-          <w:lang w:val="fr-FR"/>
-        </w:rPr>
-        <w:t>.</w:t>
+        <w:t>La proximité entre nerfs spinaux, structures costo-vertébrales, rameaux méningés et chaîne sympathique constitue un carrefour régional intéressant.</w:t>
       </w:r>
     </w:p>
     <w:p>
@@ -2071,6 +2111,7 @@
           <w:color w:val="B1842C"/>
           <w:lang w:val="fr-FR"/>
         </w:rPr>
+        <w:lastRenderedPageBreak/>
         <w:t xml:space="preserve">Intérêt en ROP — </w:t>
       </w:r>
       <w:r>
@@ -2094,7 +2135,6 @@
           <w:sz w:val="18"/>
           <w:lang w:val="fr-FR"/>
         </w:rPr>
-        <w:lastRenderedPageBreak/>
         <w:t>Cf. Chapitre 8 — Diaphragme ; Réflexothérapie occipito-podale et système neuro-méningé, pages consacrées au plexus lombal et au psoas.</w:t>
       </w:r>
     </w:p>
@@ -2570,6 +2610,7 @@
           <w:color w:val="B1842C"/>
           <w:lang w:val="fr-FR"/>
         </w:rPr>
+        <w:lastRenderedPageBreak/>
         <w:t xml:space="preserve">Intérêt en ROP — </w:t>
       </w:r>
       <w:r>
@@ -2593,7 +2634,6 @@
           <w:sz w:val="18"/>
           <w:lang w:val="fr-FR"/>
         </w:rPr>
-        <w:lastRenderedPageBreak/>
         <w:t>Cf. Chapitres 9 à 16 pour les plexus propres aux différents territoires digestifs et rénaux.</w:t>
       </w:r>
     </w:p>
@@ -3021,6 +3061,7 @@
           <w:color w:val="B1842C"/>
           <w:lang w:val="fr-FR"/>
         </w:rPr>
+        <w:lastRenderedPageBreak/>
         <w:t xml:space="preserve">Intérêt en ROP — </w:t>
       </w:r>
       <w:r>
@@ -3044,7 +3085,6 @@
           <w:sz w:val="18"/>
           <w:lang w:val="fr-FR"/>
         </w:rPr>
-        <w:lastRenderedPageBreak/>
         <w:t>Cf. Chapitre 16 — Reins et surrénales ; Chapitre 5 — Mécanisme de stress.</w:t>
       </w:r>
     </w:p>
@@ -3232,7 +3272,21 @@
         <w:rPr>
           <w:lang w:val="fr-FR"/>
         </w:rPr>
-        <w:t>Foramen jugulaire et ganglions vagaux : repères articulaires des quatrième et cinquième orteils.</w:t>
+        <w:t xml:space="preserve">Foramen jugulaire et ganglions vagaux : repères articulaires des quatrième et </w:t>
+      </w:r>
+      <w:proofErr w:type="gramStart"/>
+      <w:r>
+        <w:rPr>
+          <w:lang w:val="fr-FR"/>
+        </w:rPr>
+        <w:t>cinquième orteils</w:t>
+      </w:r>
+      <w:proofErr w:type="gramEnd"/>
+      <w:r>
+        <w:rPr>
+          <w:lang w:val="fr-FR"/>
+        </w:rPr>
+        <w:t>.</w:t>
       </w:r>
     </w:p>
     <w:p>
@@ -3619,6 +3673,7 @@
         <w:rPr>
           <w:lang w:val="fr-FR"/>
         </w:rPr>
+        <w:lastRenderedPageBreak/>
         <w:t>11.9. Chaîne ganglionnaire thoracique</w:t>
       </w:r>
     </w:p>
@@ -3640,7 +3695,6 @@
         <w:pStyle w:val="Heading2"/>
       </w:pPr>
       <w:r>
-        <w:lastRenderedPageBreak/>
         <w:t>11.10. Chaîne ganglionnaire cervicale</w:t>
       </w:r>
     </w:p>
@@ -4172,6 +4226,7 @@
         <w:rPr>
           <w:lang w:val="fr-FR"/>
         </w:rPr>
+        <w:lastRenderedPageBreak/>
         <w:t>Le SNA fonctionne dans les deux sens : commandes efférentes vers les viscères et informations afférentes vers les centres.</w:t>
       </w:r>
     </w:p>
@@ -4202,7 +4257,6 @@
         <w:rPr>
           <w:lang w:val="fr-FR"/>
         </w:rPr>
-        <w:lastRenderedPageBreak/>
         <w:t>Les zones réflexes ROP restent des repères cliniques et non une anatomie directe du système autonome sur le pied.</w:t>
       </w:r>
     </w:p>
@@ -4257,7 +4311,21 @@
         <w:rPr>
           <w:sz w:val="17"/>
         </w:rPr>
-        <w:t>3. Sato A, Sato Y, Schmidt RF. The impact of somatosensory input on autonomic functions. Rev Physiol Biochem Pharmacol. 1997;130:1-328.</w:t>
+        <w:t xml:space="preserve">3. Sato A, Sato Y, Schmidt RF. The impact of somatosensory input on autonomic functions. Rev Physiol Biochem Pharmacol. </w:t>
+      </w:r>
+      <w:proofErr w:type="gramStart"/>
+      <w:r>
+        <w:rPr>
+          <w:sz w:val="17"/>
+        </w:rPr>
+        <w:t>1997;130:1</w:t>
+      </w:r>
+      <w:proofErr w:type="gramEnd"/>
+      <w:r>
+        <w:rPr>
+          <w:sz w:val="17"/>
+        </w:rPr>
+        <w:t>-328.</w:t>
       </w:r>
     </w:p>
     <w:p>
@@ -4281,7 +4349,21 @@
         <w:rPr>
           <w:sz w:val="17"/>
         </w:rPr>
-        <w:t>5. de Groat WC, Vizzard MA, Araki I, Roppolo JR. Spinal interneurons and preganglionic neurons in sacral autonomic reflex pathways. Prog Brain Res. 1996;107:97-111.</w:t>
+        <w:t xml:space="preserve">5. de Groat WC, Vizzard MA, Araki I, Roppolo JR. Spinal interneurons and preganglionic neurons in sacral autonomic reflex pathways. Prog Brain Res. </w:t>
+      </w:r>
+      <w:proofErr w:type="gramStart"/>
+      <w:r>
+        <w:rPr>
+          <w:sz w:val="17"/>
+        </w:rPr>
+        <w:t>1996;107:97</w:t>
+      </w:r>
+      <w:proofErr w:type="gramEnd"/>
+      <w:r>
+        <w:rPr>
+          <w:sz w:val="17"/>
+        </w:rPr>
+        <w:t>-111.</w:t>
       </w:r>
     </w:p>
     <w:p>
@@ -4293,7 +4375,21 @@
         <w:rPr>
           <w:sz w:val="17"/>
         </w:rPr>
-        <w:t>6. Brierley SM, Hibberd TJ, Spencer NJ. Spinal afferent innervation of the colon and rectum. Front Cell Neurosci. 2018;12:467.</w:t>
+        <w:t xml:space="preserve">6. Brierley SM, Hibberd TJ, Spencer NJ. Spinal afferent innervation of the colon and rectum. Front Cell Neurosci. </w:t>
+      </w:r>
+      <w:proofErr w:type="gramStart"/>
+      <w:r>
+        <w:rPr>
+          <w:sz w:val="17"/>
+        </w:rPr>
+        <w:t>2018;12:467</w:t>
+      </w:r>
+      <w:proofErr w:type="gramEnd"/>
+      <w:r>
+        <w:rPr>
+          <w:sz w:val="17"/>
+        </w:rPr>
+        <w:t>.</w:t>
       </w:r>
     </w:p>
     <w:p>
@@ -4319,8 +4415,9 @@
       <w:r>
         <w:rPr>
           <w:sz w:val="17"/>
-        </w:rPr>
-        <w:t xml:space="preserve">8. Tobaldini E, Costantino G, Solbiati M, et al. Sleep, sleep deprivation, autonomic nervous system and cardiovascular diseases. </w:t>
+          <w:lang w:val="fr-FR"/>
+        </w:rPr>
+        <w:t xml:space="preserve">8. </w:t>
       </w:r>
       <w:proofErr w:type="spellStart"/>
       <w:r>
@@ -4328,6 +4425,44 @@
           <w:sz w:val="17"/>
           <w:lang w:val="fr-FR"/>
         </w:rPr>
+        <w:t>Tobaldini</w:t>
+      </w:r>
+      <w:proofErr w:type="spellEnd"/>
+      <w:r>
+        <w:rPr>
+          <w:sz w:val="17"/>
+          <w:lang w:val="fr-FR"/>
+        </w:rPr>
+        <w:t xml:space="preserve"> E, Costantino G, </w:t>
+      </w:r>
+      <w:proofErr w:type="spellStart"/>
+      <w:r>
+        <w:rPr>
+          <w:sz w:val="17"/>
+          <w:lang w:val="fr-FR"/>
+        </w:rPr>
+        <w:t>Solbiati</w:t>
+      </w:r>
+      <w:proofErr w:type="spellEnd"/>
+      <w:r>
+        <w:rPr>
+          <w:sz w:val="17"/>
+          <w:lang w:val="fr-FR"/>
+        </w:rPr>
+        <w:t xml:space="preserve"> M, et al. </w:t>
+      </w:r>
+      <w:r>
+        <w:rPr>
+          <w:sz w:val="17"/>
+        </w:rPr>
+        <w:t xml:space="preserve">Sleep, sleep deprivation, autonomic nervous system and cardiovascular diseases. </w:t>
+      </w:r>
+      <w:proofErr w:type="spellStart"/>
+      <w:r>
+        <w:rPr>
+          <w:sz w:val="17"/>
+          <w:lang w:val="fr-FR"/>
+        </w:rPr>
         <w:t>Neurosci</w:t>
       </w:r>
       <w:proofErr w:type="spellEnd"/>
@@ -4352,7 +4487,39 @@
           <w:sz w:val="17"/>
           <w:lang w:val="fr-FR"/>
         </w:rPr>
-        <w:t xml:space="preserve"> Rev. 2017;74(Pt B):321-329.</w:t>
+        <w:t xml:space="preserve"> Rev. </w:t>
+      </w:r>
+      <w:proofErr w:type="gramStart"/>
+      <w:r>
+        <w:rPr>
+          <w:sz w:val="17"/>
+          <w:lang w:val="fr-FR"/>
+        </w:rPr>
+        <w:t>2017;</w:t>
+      </w:r>
+      <w:proofErr w:type="gramEnd"/>
+      <w:r>
+        <w:rPr>
+          <w:sz w:val="17"/>
+          <w:lang w:val="fr-FR"/>
+        </w:rPr>
+        <w:t>74(Pt B</w:t>
+      </w:r>
+      <w:proofErr w:type="gramStart"/>
+      <w:r>
+        <w:rPr>
+          <w:sz w:val="17"/>
+          <w:lang w:val="fr-FR"/>
+        </w:rPr>
+        <w:t>):</w:t>
+      </w:r>
+      <w:proofErr w:type="gramEnd"/>
+      <w:r>
+        <w:rPr>
+          <w:sz w:val="17"/>
+          <w:lang w:val="fr-FR"/>
+        </w:rPr>
+        <w:t>321-329.</w:t>
       </w:r>
     </w:p>
     <w:p>

</xml_diff>

<commit_message>
Refresh Chapter 4 rework and Chapter 15 reflex protocol
</commit_message>
<xml_diff>
--- a/public/chapter-4/Chapter4_SNA_AI_Rework_v2.docx
+++ b/public/chapter-4/Chapter4_SNA_AI_Rework_v2.docx
@@ -1044,35 +1044,7 @@
         <w:rPr>
           <w:lang w:val="fr-FR"/>
         </w:rPr>
-        <w:t xml:space="preserve">Le sinus carotidien et </w:t>
-      </w:r>
-      <w:proofErr w:type="gramStart"/>
-      <w:r>
-        <w:rPr>
-          <w:lang w:val="fr-FR"/>
-        </w:rPr>
-        <w:t>le glomus</w:t>
-      </w:r>
-      <w:proofErr w:type="gramEnd"/>
-      <w:r>
-        <w:rPr>
-          <w:lang w:val="fr-FR"/>
-        </w:rPr>
-        <w:t xml:space="preserve"> carotidien sont des repères physiologiques importants. </w:t>
-      </w:r>
-      <w:proofErr w:type="gramStart"/>
-      <w:r>
-        <w:rPr>
-          <w:lang w:val="fr-FR"/>
-        </w:rPr>
-        <w:t>Tout</w:t>
-      </w:r>
-      <w:proofErr w:type="gramEnd"/>
-      <w:r>
-        <w:rPr>
-          <w:lang w:val="fr-FR"/>
-        </w:rPr>
-        <w:t xml:space="preserve"> malaise, syncope, douleur thoracique ou dyspnée impose d’interrompre le geste et d’orienter vers une évaluation médicale.</w:t>
+        <w:t>Le sinus carotidien et le glomus carotidien sont des repères physiologiques importants. Tout malaise, syncope, douleur thoracique ou dyspnée impose d’interrompre le geste et d’orienter vers une évaluation médicale.</w:t>
       </w:r>
     </w:p>
     <w:p>
@@ -2298,7 +2270,19 @@
         <w:rPr>
           <w:lang w:val="fr-FR"/>
         </w:rPr>
-        <w:t>Cette section conserve la terminologie historique du chapitre. Les fibres sensitives viscérales ne sont cependant pas des neurones sympathiques moteurs : elles peuvent cheminer avec les voies sympathiques avant de rejoindre leurs corps cellulaires dans les ganglions spinaux.</w:t>
+        <w:t>Les fibres sensitives viscérales chemine</w:t>
+      </w:r>
+      <w:r>
+        <w:rPr>
+          <w:lang w:val="fr-FR"/>
+        </w:rPr>
+        <w:t>nt</w:t>
+      </w:r>
+      <w:r>
+        <w:rPr>
+          <w:lang w:val="fr-FR"/>
+        </w:rPr>
+        <w:t xml:space="preserve"> avec les voies sympathiques avant de rejoindre leurs corps cellulaires dans les ganglions spinaux.</w:t>
       </w:r>
     </w:p>
     <w:p>
@@ -3272,21 +3256,7 @@
         <w:rPr>
           <w:lang w:val="fr-FR"/>
         </w:rPr>
-        <w:t xml:space="preserve">Foramen jugulaire et ganglions vagaux : repères articulaires des quatrième et </w:t>
-      </w:r>
-      <w:proofErr w:type="gramStart"/>
-      <w:r>
-        <w:rPr>
-          <w:lang w:val="fr-FR"/>
-        </w:rPr>
-        <w:t>cinquième orteils</w:t>
-      </w:r>
-      <w:proofErr w:type="gramEnd"/>
-      <w:r>
-        <w:rPr>
-          <w:lang w:val="fr-FR"/>
-        </w:rPr>
-        <w:t>.</w:t>
+        <w:t>Foramen jugulaire et ganglions vagaux : repères articulaires des quatrième et cinquième orteils.</w:t>
       </w:r>
     </w:p>
     <w:p>
@@ -4311,21 +4281,7 @@
         <w:rPr>
           <w:sz w:val="17"/>
         </w:rPr>
-        <w:t xml:space="preserve">3. Sato A, Sato Y, Schmidt RF. The impact of somatosensory input on autonomic functions. Rev Physiol Biochem Pharmacol. </w:t>
-      </w:r>
-      <w:proofErr w:type="gramStart"/>
-      <w:r>
-        <w:rPr>
-          <w:sz w:val="17"/>
-        </w:rPr>
-        <w:t>1997;130:1</w:t>
-      </w:r>
-      <w:proofErr w:type="gramEnd"/>
-      <w:r>
-        <w:rPr>
-          <w:sz w:val="17"/>
-        </w:rPr>
-        <w:t>-328.</w:t>
+        <w:t>3. Sato A, Sato Y, Schmidt RF. The impact of somatosensory input on autonomic functions. Rev Physiol Biochem Pharmacol. 1997;130:1-328.</w:t>
       </w:r>
     </w:p>
     <w:p>
@@ -4349,21 +4305,7 @@
         <w:rPr>
           <w:sz w:val="17"/>
         </w:rPr>
-        <w:t xml:space="preserve">5. de Groat WC, Vizzard MA, Araki I, Roppolo JR. Spinal interneurons and preganglionic neurons in sacral autonomic reflex pathways. Prog Brain Res. </w:t>
-      </w:r>
-      <w:proofErr w:type="gramStart"/>
-      <w:r>
-        <w:rPr>
-          <w:sz w:val="17"/>
-        </w:rPr>
-        <w:t>1996;107:97</w:t>
-      </w:r>
-      <w:proofErr w:type="gramEnd"/>
-      <w:r>
-        <w:rPr>
-          <w:sz w:val="17"/>
-        </w:rPr>
-        <w:t>-111.</w:t>
+        <w:t>5. de Groat WC, Vizzard MA, Araki I, Roppolo JR. Spinal interneurons and preganglionic neurons in sacral autonomic reflex pathways. Prog Brain Res. 1996;107:97-111.</w:t>
       </w:r>
     </w:p>
     <w:p>
@@ -4375,21 +4317,7 @@
         <w:rPr>
           <w:sz w:val="17"/>
         </w:rPr>
-        <w:t xml:space="preserve">6. Brierley SM, Hibberd TJ, Spencer NJ. Spinal afferent innervation of the colon and rectum. Front Cell Neurosci. </w:t>
-      </w:r>
-      <w:proofErr w:type="gramStart"/>
-      <w:r>
-        <w:rPr>
-          <w:sz w:val="17"/>
-        </w:rPr>
-        <w:t>2018;12:467</w:t>
-      </w:r>
-      <w:proofErr w:type="gramEnd"/>
-      <w:r>
-        <w:rPr>
-          <w:sz w:val="17"/>
-        </w:rPr>
-        <w:t>.</w:t>
+        <w:t>6. Brierley SM, Hibberd TJ, Spencer NJ. Spinal afferent innervation of the colon and rectum. Front Cell Neurosci. 2018;12:467.</w:t>
       </w:r>
     </w:p>
     <w:p>
@@ -4487,39 +4415,7 @@
           <w:sz w:val="17"/>
           <w:lang w:val="fr-FR"/>
         </w:rPr>
-        <w:t xml:space="preserve"> Rev. </w:t>
-      </w:r>
-      <w:proofErr w:type="gramStart"/>
-      <w:r>
-        <w:rPr>
-          <w:sz w:val="17"/>
-          <w:lang w:val="fr-FR"/>
-        </w:rPr>
-        <w:t>2017;</w:t>
-      </w:r>
-      <w:proofErr w:type="gramEnd"/>
-      <w:r>
-        <w:rPr>
-          <w:sz w:val="17"/>
-          <w:lang w:val="fr-FR"/>
-        </w:rPr>
-        <w:t>74(Pt B</w:t>
-      </w:r>
-      <w:proofErr w:type="gramStart"/>
-      <w:r>
-        <w:rPr>
-          <w:sz w:val="17"/>
-          <w:lang w:val="fr-FR"/>
-        </w:rPr>
-        <w:t>):</w:t>
-      </w:r>
-      <w:proofErr w:type="gramEnd"/>
-      <w:r>
-        <w:rPr>
-          <w:sz w:val="17"/>
-          <w:lang w:val="fr-FR"/>
-        </w:rPr>
-        <w:t>321-329.</w:t>
+        <w:t xml:space="preserve"> Rev. 2017;74(Pt B):321-329.</w:t>
       </w:r>
     </w:p>
     <w:p>

</xml_diff>